<commit_message>
Publish China Walls JFE acceptance and update CV
</commit_message>
<xml_diff>
--- a/Wang_CV.docx
+++ b/Wang_CV.docx
@@ -99,6 +99,9 @@
     </w:p>
     <w:p>
       <w:pPr>
+        <w:tabs>
+          <w:tab w:val="right" w:pos="9360"/>
+        </w:tabs>
         <w:spacing w:after="0" w:line="240" w:lineRule="auto"/>
         <w:rPr>
           <w:rFonts w:ascii="Times New Roman" w:hAnsi="Times New Roman" w:cs="Times New Roman"/>
@@ -120,37 +123,7 @@
         <w:rPr>
           <w:rFonts w:ascii="Times New Roman" w:hAnsi="Times New Roman" w:cs="Times New Roman"/>
         </w:rPr>
-        <w:tab/>
-      </w:r>
-      <w:r>
-        <w:rPr>
-          <w:rFonts w:ascii="Times New Roman" w:hAnsi="Times New Roman" w:cs="Times New Roman"/>
-        </w:rPr>
-        <w:tab/>
-      </w:r>
-      <w:r>
-        <w:rPr>
-          <w:rFonts w:ascii="Times New Roman" w:hAnsi="Times New Roman" w:cs="Times New Roman"/>
-        </w:rPr>
-        <w:tab/>
-      </w:r>
-      <w:r>
-        <w:rPr>
-          <w:rFonts w:ascii="Times New Roman" w:hAnsi="Times New Roman" w:cs="Times New Roman"/>
-        </w:rPr>
-        <w:t xml:space="preserve">          </w:t>
-      </w:r>
-      <w:r>
-        <w:rPr>
-          <w:rFonts w:ascii="Times New Roman" w:hAnsi="Times New Roman" w:cs="Times New Roman"/>
-        </w:rPr>
-        <w:t>Web: https://fin</w:t>
-      </w:r>
-      <w:r>
-        <w:rPr>
-          <w:rFonts w:ascii="Times New Roman" w:hAnsi="Times New Roman" w:cs="Times New Roman"/>
-        </w:rPr>
-        <w:t>ance.wharton.upenn.edu/~wangchj</w:t>
+        <w:t>Web: https://finance.wharton.upenn.edu/~wangchj</w:t>
       </w:r>
     </w:p>
     <w:p>
@@ -179,7 +152,7 @@
         <w:rPr>
           <w:rFonts w:ascii="Times New Roman" w:hAnsi="Times New Roman" w:cs="Times New Roman"/>
         </w:rPr>
-        <w:t>June</w:t>
+        <w:t>September</w:t>
       </w:r>
       <w:r>
         <w:rPr>
@@ -1069,61 +1042,116 @@
         <w:rPr>
           <w:rFonts w:ascii="Times New Roman" w:hAnsi="Times New Roman" w:cs="Times New Roman"/>
         </w:rPr>
-        <w:t>. China Walls</w:t>
-      </w:r>
-      <w:r>
-        <w:rPr>
-          <w:rFonts w:ascii="Times New Roman" w:hAnsi="Times New Roman" w:cs="Times New Roman"/>
-        </w:rPr>
-        <w:tab/>
-      </w:r>
-      <w:r>
-        <w:rPr>
-          <w:rFonts w:ascii="Times New Roman" w:hAnsi="Times New Roman" w:cs="Times New Roman"/>
-        </w:rPr>
-        <w:tab/>
-      </w:r>
-      <w:r>
-        <w:rPr>
-          <w:rFonts w:ascii="Times New Roman" w:hAnsi="Times New Roman" w:cs="Times New Roman"/>
-        </w:rPr>
-        <w:tab/>
-      </w:r>
-      <w:r>
-        <w:rPr>
-          <w:rFonts w:ascii="Times New Roman" w:hAnsi="Times New Roman" w:cs="Times New Roman"/>
-        </w:rPr>
-        <w:tab/>
-      </w:r>
-      <w:r>
-        <w:rPr>
-          <w:rFonts w:ascii="Times New Roman" w:hAnsi="Times New Roman" w:cs="Times New Roman"/>
-        </w:rPr>
-        <w:tab/>
-      </w:r>
-      <w:r>
-        <w:rPr>
-          <w:rFonts w:ascii="Times New Roman" w:hAnsi="Times New Roman" w:cs="Times New Roman"/>
-        </w:rPr>
-        <w:tab/>
-      </w:r>
-      <w:r>
-        <w:rPr>
-          <w:rFonts w:ascii="Times New Roman" w:hAnsi="Times New Roman" w:cs="Times New Roman"/>
-        </w:rPr>
-        <w:tab/>
-      </w:r>
-      <w:r>
-        <w:rPr>
-          <w:rFonts w:ascii="Times New Roman" w:hAnsi="Times New Roman" w:cs="Times New Roman"/>
-        </w:rPr>
-        <w:tab/>
-      </w:r>
-      <w:r>
-        <w:rPr>
-          <w:rFonts w:ascii="Times New Roman" w:hAnsi="Times New Roman" w:cs="Times New Roman"/>
-        </w:rPr>
-        <w:t>2024</w:t>
+        <w:t>. Search in Over-the-Counter Markets</w:t>
+      </w:r>
+      <w:r>
+        <w:rPr>
+          <w:rFonts w:ascii="Times New Roman" w:hAnsi="Times New Roman" w:cs="Times New Roman"/>
+        </w:rPr>
+        <w:tab/>
+      </w:r>
+      <w:r>
+        <w:rPr>
+          <w:rFonts w:ascii="Times New Roman" w:hAnsi="Times New Roman" w:cs="Times New Roman"/>
+        </w:rPr>
+        <w:tab/>
+      </w:r>
+      <w:r>
+        <w:rPr>
+          <w:rFonts w:ascii="Times New Roman" w:hAnsi="Times New Roman" w:cs="Times New Roman"/>
+        </w:rPr>
+        <w:tab/>
+      </w:r>
+      <w:r>
+        <w:rPr>
+          <w:rFonts w:ascii="Times New Roman" w:hAnsi="Times New Roman" w:cs="Times New Roman"/>
+        </w:rPr>
+        <w:tab/>
+      </w:r>
+      <w:r>
+        <w:rPr>
+          <w:rFonts w:ascii="Times New Roman" w:hAnsi="Times New Roman" w:cs="Times New Roman"/>
+        </w:rPr>
+        <w:tab/>
+      </w:r>
+      <w:r>
+        <w:rPr>
+          <w:rFonts w:ascii="Times New Roman" w:hAnsi="Times New Roman" w:cs="Times New Roman"/>
+        </w:rPr>
+        <w:t>R&amp;R</w:t>
+      </w:r>
+      <w:r>
+        <w:rPr>
+          <w:rFonts w:ascii="Times New Roman" w:hAnsi="Times New Roman" w:cs="Times New Roman"/>
+        </w:rPr>
+        <w:t xml:space="preserve"> at JF</w:t>
+      </w:r>
+      <w:r>
+        <w:rPr>
+          <w:rFonts w:ascii="Times New Roman" w:hAnsi="Times New Roman" w:cs="Times New Roman"/>
+        </w:rPr>
+        <w:t>, 2022</w:t>
+      </w:r>
+    </w:p>
+    <w:p>
+      <w:pPr>
+        <w:spacing w:after="0" w:line="240" w:lineRule="auto"/>
+        <w:jc w:val="both"/>
+        <w:rPr>
+          <w:rFonts w:ascii="Times New Roman" w:hAnsi="Times New Roman" w:cs="Times New Roman"/>
+        </w:rPr>
+      </w:pPr>
+    </w:p>
+    <w:p>
+      <w:pPr>
+        <w:spacing w:after="0" w:line="240" w:lineRule="auto"/>
+        <w:jc w:val="both"/>
+        <w:rPr>
+          <w:rFonts w:ascii="Times New Roman" w:hAnsi="Times New Roman" w:cs="Times New Roman"/>
+          <w:i/>
+        </w:rPr>
+      </w:pPr>
+      <w:r>
+        <w:rPr>
+          <w:rFonts w:ascii="Times New Roman" w:hAnsi="Times New Roman" w:cs="Times New Roman"/>
+        </w:rPr>
+        <w:t>7</w:t>
+      </w:r>
+      <w:r>
+        <w:rPr>
+          <w:rFonts w:ascii="Times New Roman" w:hAnsi="Times New Roman" w:cs="Times New Roman"/>
+        </w:rPr>
+        <w:t xml:space="preserve">. </w:t>
+      </w:r>
+      <w:r>
+        <w:rPr>
+          <w:rFonts w:ascii="Times New Roman" w:hAnsi="Times New Roman" w:cs="Times New Roman"/>
+        </w:rPr>
+        <w:t>Information Chasing versus Adverse Selection</w:t>
+      </w:r>
+      <w:r>
+        <w:rPr>
+          <w:rFonts w:ascii="Times New Roman" w:hAnsi="Times New Roman" w:cs="Times New Roman"/>
+        </w:rPr>
+        <w:tab/>
+      </w:r>
+      <w:r>
+        <w:rPr>
+          <w:rFonts w:ascii="Times New Roman" w:hAnsi="Times New Roman" w:cs="Times New Roman"/>
+        </w:rPr>
+        <w:tab/>
+      </w:r>
+      <w:r>
+        <w:rPr>
+          <w:rFonts w:ascii="Times New Roman" w:hAnsi="Times New Roman" w:cs="Times New Roman"/>
+        </w:rPr>
+        <w:tab/>
+      </w:r>
+      <w:r>
+        <w:rPr>
+          <w:rFonts w:ascii="Times New Roman" w:hAnsi="Times New Roman" w:cs="Times New Roman"/>
+        </w:rPr>
+        <w:t>2022</w:t>
       </w:r>
     </w:p>
     <w:p>
@@ -1133,6 +1161,7 @@
         <w:jc w:val="both"/>
         <w:rPr>
           <w:rFonts w:ascii="Times New Roman" w:hAnsi="Times New Roman" w:cs="Times New Roman"/>
+          <w:b/>
         </w:rPr>
       </w:pPr>
       <w:r>
@@ -1145,103 +1174,45 @@
         <w:rPr>
           <w:rFonts w:ascii="Times New Roman" w:hAnsi="Times New Roman" w:cs="Times New Roman"/>
         </w:rPr>
-        <w:t>Tomy Lee, Daniel Nathan</w:t>
-      </w:r>
-    </w:p>
-    <w:p>
-      <w:pPr>
-        <w:spacing w:after="0" w:line="240" w:lineRule="auto"/>
-        <w:jc w:val="both"/>
-        <w:rPr>
-          <w:rFonts w:ascii="Times New Roman" w:hAnsi="Times New Roman" w:cs="Times New Roman"/>
-        </w:rPr>
-      </w:pPr>
-    </w:p>
-    <w:p>
-      <w:pPr>
-        <w:spacing w:after="0" w:line="240" w:lineRule="auto"/>
-        <w:jc w:val="both"/>
-        <w:rPr>
-          <w:rFonts w:ascii="Times New Roman" w:hAnsi="Times New Roman" w:cs="Times New Roman"/>
-        </w:rPr>
-      </w:pPr>
-      <w:r>
-        <w:rPr>
-          <w:rFonts w:ascii="Times New Roman" w:hAnsi="Times New Roman" w:cs="Times New Roman"/>
-        </w:rPr>
-        <w:t>7</w:t>
-      </w:r>
-      <w:r>
-        <w:rPr>
-          <w:rFonts w:ascii="Times New Roman" w:hAnsi="Times New Roman" w:cs="Times New Roman"/>
-        </w:rPr>
-        <w:t>. Search in Over-the-Counter Markets</w:t>
-      </w:r>
-      <w:r>
-        <w:rPr>
-          <w:rFonts w:ascii="Times New Roman" w:hAnsi="Times New Roman" w:cs="Times New Roman"/>
-        </w:rPr>
-        <w:tab/>
-      </w:r>
-      <w:r>
-        <w:rPr>
-          <w:rFonts w:ascii="Times New Roman" w:hAnsi="Times New Roman" w:cs="Times New Roman"/>
-        </w:rPr>
-        <w:tab/>
-      </w:r>
-      <w:r>
-        <w:rPr>
-          <w:rFonts w:ascii="Times New Roman" w:hAnsi="Times New Roman" w:cs="Times New Roman"/>
-        </w:rPr>
-        <w:tab/>
-      </w:r>
-      <w:r>
-        <w:rPr>
-          <w:rFonts w:ascii="Times New Roman" w:hAnsi="Times New Roman" w:cs="Times New Roman"/>
-        </w:rPr>
-        <w:tab/>
-      </w:r>
-      <w:r>
-        <w:rPr>
-          <w:rFonts w:ascii="Times New Roman" w:hAnsi="Times New Roman" w:cs="Times New Roman"/>
-        </w:rPr>
-        <w:tab/>
-      </w:r>
-      <w:r>
-        <w:rPr>
-          <w:rFonts w:ascii="Times New Roman" w:hAnsi="Times New Roman" w:cs="Times New Roman"/>
-        </w:rPr>
-        <w:t>R&amp;R</w:t>
-      </w:r>
-      <w:r>
-        <w:rPr>
-          <w:rFonts w:ascii="Times New Roman" w:hAnsi="Times New Roman" w:cs="Times New Roman"/>
-        </w:rPr>
-        <w:t xml:space="preserve"> at JF</w:t>
-      </w:r>
-      <w:r>
-        <w:rPr>
-          <w:rFonts w:ascii="Times New Roman" w:hAnsi="Times New Roman" w:cs="Times New Roman"/>
-        </w:rPr>
-        <w:t>, 2022</w:t>
-      </w:r>
-    </w:p>
-    <w:p>
-      <w:pPr>
-        <w:spacing w:after="0" w:line="240" w:lineRule="auto"/>
-        <w:jc w:val="both"/>
-        <w:rPr>
-          <w:rFonts w:ascii="Times New Roman" w:hAnsi="Times New Roman" w:cs="Times New Roman"/>
-        </w:rPr>
-      </w:pPr>
-    </w:p>
-    <w:p>
-      <w:pPr>
-        <w:spacing w:after="0" w:line="240" w:lineRule="auto"/>
-        <w:jc w:val="both"/>
-        <w:rPr>
-          <w:rFonts w:ascii="Times New Roman" w:hAnsi="Times New Roman" w:cs="Times New Roman"/>
-          <w:i/>
+        <w:t xml:space="preserve">Gabor Pinter, </w:t>
+      </w:r>
+      <w:proofErr w:type="spellStart"/>
+      <w:r>
+        <w:rPr>
+          <w:rFonts w:ascii="Times New Roman" w:hAnsi="Times New Roman" w:cs="Times New Roman"/>
+        </w:rPr>
+        <w:t>Junyuan</w:t>
+      </w:r>
+      <w:proofErr w:type="spellEnd"/>
+      <w:r>
+        <w:rPr>
+          <w:rFonts w:ascii="Times New Roman" w:hAnsi="Times New Roman" w:cs="Times New Roman"/>
+        </w:rPr>
+        <w:t xml:space="preserve"> Zou</w:t>
+      </w:r>
+      <w:r>
+        <w:rPr>
+          <w:rFonts w:ascii="Times New Roman" w:hAnsi="Times New Roman" w:cs="Times New Roman"/>
+          <w:b/>
+        </w:rPr>
+        <w:t xml:space="preserve"> </w:t>
+      </w:r>
+    </w:p>
+    <w:p>
+      <w:pPr>
+        <w:spacing w:after="0" w:line="240" w:lineRule="auto"/>
+        <w:jc w:val="both"/>
+        <w:rPr>
+          <w:rFonts w:ascii="Times New Roman" w:hAnsi="Times New Roman" w:cs="Times New Roman"/>
+        </w:rPr>
+      </w:pPr>
+    </w:p>
+    <w:p>
+      <w:pPr>
+        <w:spacing w:after="0" w:line="240" w:lineRule="auto"/>
+        <w:jc w:val="both"/>
+        <w:rPr>
+          <w:rFonts w:ascii="Times New Roman" w:hAnsi="Times New Roman" w:cs="Times New Roman"/>
         </w:rPr>
       </w:pPr>
       <w:r>
@@ -1249,110 +1220,6 @@
           <w:rFonts w:ascii="Times New Roman" w:hAnsi="Times New Roman" w:cs="Times New Roman"/>
         </w:rPr>
         <w:t>6</w:t>
-      </w:r>
-      <w:r>
-        <w:rPr>
-          <w:rFonts w:ascii="Times New Roman" w:hAnsi="Times New Roman" w:cs="Times New Roman"/>
-        </w:rPr>
-        <w:t xml:space="preserve">. </w:t>
-      </w:r>
-      <w:r>
-        <w:rPr>
-          <w:rFonts w:ascii="Times New Roman" w:hAnsi="Times New Roman" w:cs="Times New Roman"/>
-        </w:rPr>
-        <w:t>Information Chasing versus Adverse Selection</w:t>
-      </w:r>
-      <w:r>
-        <w:rPr>
-          <w:rFonts w:ascii="Times New Roman" w:hAnsi="Times New Roman" w:cs="Times New Roman"/>
-        </w:rPr>
-        <w:tab/>
-      </w:r>
-      <w:r>
-        <w:rPr>
-          <w:rFonts w:ascii="Times New Roman" w:hAnsi="Times New Roman" w:cs="Times New Roman"/>
-        </w:rPr>
-        <w:tab/>
-      </w:r>
-      <w:r>
-        <w:rPr>
-          <w:rFonts w:ascii="Times New Roman" w:hAnsi="Times New Roman" w:cs="Times New Roman"/>
-        </w:rPr>
-        <w:tab/>
-      </w:r>
-      <w:r>
-        <w:rPr>
-          <w:rFonts w:ascii="Times New Roman" w:hAnsi="Times New Roman" w:cs="Times New Roman"/>
-        </w:rPr>
-        <w:t>2022</w:t>
-      </w:r>
-    </w:p>
-    <w:p>
-      <w:pPr>
-        <w:spacing w:after="0" w:line="240" w:lineRule="auto"/>
-        <w:ind w:firstLine="216"/>
-        <w:jc w:val="both"/>
-        <w:rPr>
-          <w:rFonts w:ascii="Times New Roman" w:hAnsi="Times New Roman" w:cs="Times New Roman"/>
-          <w:b/>
-        </w:rPr>
-      </w:pPr>
-      <w:r>
-        <w:rPr>
-          <w:rFonts w:ascii="Times New Roman" w:hAnsi="Times New Roman" w:cs="Times New Roman"/>
-        </w:rPr>
-        <w:t xml:space="preserve">w/ </w:t>
-      </w:r>
-      <w:r>
-        <w:rPr>
-          <w:rFonts w:ascii="Times New Roman" w:hAnsi="Times New Roman" w:cs="Times New Roman"/>
-        </w:rPr>
-        <w:t xml:space="preserve">Gabor Pinter, </w:t>
-      </w:r>
-      <w:proofErr w:type="spellStart"/>
-      <w:r>
-        <w:rPr>
-          <w:rFonts w:ascii="Times New Roman" w:hAnsi="Times New Roman" w:cs="Times New Roman"/>
-        </w:rPr>
-        <w:t>Junyuan</w:t>
-      </w:r>
-      <w:proofErr w:type="spellEnd"/>
-      <w:r>
-        <w:rPr>
-          <w:rFonts w:ascii="Times New Roman" w:hAnsi="Times New Roman" w:cs="Times New Roman"/>
-        </w:rPr>
-        <w:t xml:space="preserve"> Zou</w:t>
-      </w:r>
-      <w:r>
-        <w:rPr>
-          <w:rFonts w:ascii="Times New Roman" w:hAnsi="Times New Roman" w:cs="Times New Roman"/>
-          <w:b/>
-        </w:rPr>
-        <w:t xml:space="preserve"> </w:t>
-      </w:r>
-    </w:p>
-    <w:p>
-      <w:pPr>
-        <w:spacing w:after="0" w:line="240" w:lineRule="auto"/>
-        <w:jc w:val="both"/>
-        <w:rPr>
-          <w:rFonts w:ascii="Times New Roman" w:hAnsi="Times New Roman" w:cs="Times New Roman"/>
-        </w:rPr>
-      </w:pPr>
-    </w:p>
-    <w:p>
-      <w:pPr>
-        <w:spacing w:after="0" w:line="240" w:lineRule="auto"/>
-        <w:jc w:val="both"/>
-        <w:rPr>
-          <w:rFonts w:ascii="Times New Roman" w:hAnsi="Times New Roman" w:cs="Times New Roman"/>
-        </w:rPr>
-      </w:pPr>
-      <w:r>
-        <w:rPr>
-          <w:rFonts w:ascii="Times New Roman" w:hAnsi="Times New Roman" w:cs="Times New Roman"/>
-        </w:rPr>
-        <w:t>5</w:t>
       </w:r>
       <w:r>
         <w:rPr>
@@ -1642,7 +1509,7 @@
         <w:rPr>
           <w:rFonts w:ascii="Times New Roman" w:hAnsi="Times New Roman" w:cs="Times New Roman"/>
         </w:rPr>
-        <w:t>4</w:t>
+        <w:t>5</w:t>
       </w:r>
       <w:r>
         <w:rPr>
@@ -1711,6 +1578,7 @@
     </w:p>
     <w:p>
       <w:pPr>
+        <w:keepNext/>
         <w:spacing w:after="0" w:line="240" w:lineRule="auto"/>
         <w:jc w:val="both"/>
         <w:rPr>
@@ -1727,6 +1595,64 @@
         </w:rPr>
         <w:lastRenderedPageBreak/>
         <w:t>Publications</w:t>
+      </w:r>
+    </w:p>
+    <w:p>
+      <w:pPr>
+        <w:keepNext/>
+        <w:spacing w:after="0" w:line="240" w:lineRule="auto"/>
+        <w:jc w:val="both"/>
+        <w:rPr>
+          <w:rFonts w:ascii="Times New Roman" w:hAnsi="Times New Roman" w:cs="Times New Roman"/>
+        </w:rPr>
+      </w:pPr>
+      <w:r>
+        <w:rPr>
+          <w:rFonts w:ascii="Times New Roman" w:hAnsi="Times New Roman" w:cs="Times New Roman"/>
+        </w:rPr>
+        <w:t>4</w:t>
+      </w:r>
+      <w:r>
+        <w:rPr>
+          <w:rFonts w:ascii="Times New Roman" w:hAnsi="Times New Roman" w:cs="Times New Roman"/>
+        </w:rPr>
+        <w:t>. China Walls</w:t>
+      </w:r>
+      <w:r>
+        <w:rPr>
+          <w:rFonts w:ascii="Times New Roman" w:hAnsi="Times New Roman" w:cs="Times New Roman"/>
+        </w:rPr>
+        <w:tab/>
+        <w:t xml:space="preserve">Forthcoming at </w:t>
+      </w:r>
+      <w:r>
+        <w:rPr>
+          <w:rFonts w:ascii="Times New Roman" w:hAnsi="Times New Roman" w:cs="Times New Roman"/>
+          <w:i w:val="1"/>
+        </w:rPr>
+        <w:t>Journal of Financial Economics</w:t>
+      </w:r>
+    </w:p>
+    <w:p>
+      <w:pPr>
+        <w:spacing w:after="0" w:line="240" w:lineRule="auto"/>
+        <w:ind w:firstLine="216"/>
+        <w:jc w:val="both"/>
+        <w:rPr>
+          <w:rFonts w:ascii="Times New Roman" w:hAnsi="Times New Roman" w:cs="Times New Roman"/>
+        </w:rPr>
+      </w:pPr>
+      <w:r>
+        <w:rPr>
+          <w:rFonts w:ascii="Times New Roman" w:hAnsi="Times New Roman" w:cs="Times New Roman"/>
+        </w:rPr>
+        <w:t xml:space="preserve">w/ </w:t>
+      </w:r>
+      <w:r>
+        <w:rPr>
+          <w:rFonts w:ascii="Times New Roman" w:hAnsi="Times New Roman" w:cs="Times New Roman"/>
+        </w:rPr>
+        <w:t>Tomy Lee, Daniel Nathan</w:t>
       </w:r>
     </w:p>
     <w:p>
@@ -5160,18 +5086,6 @@
         </w:rPr>
         <w:t>Ruslan Svershkov, Warwick Business School, Committee member</w:t>
       </w:r>
-    </w:p>
-    <w:p>
-      <w:pPr>
-        <w:spacing w:after="0" w:line="240" w:lineRule="auto"/>
-        <w:jc w:val="both"/>
-        <w:rPr>
-          <w:rFonts w:ascii="Times New Roman" w:hAnsi="Times New Roman" w:cs="Times New Roman"/>
-          <w:b/>
-          <w:sz w:val="24"/>
-          <w:szCs w:val="24"/>
-        </w:rPr>
-      </w:pPr>
     </w:p>
     <w:p>
       <w:pPr>

</xml_diff>

<commit_message>
Refine China Walls spacing in CV
</commit_message>
<xml_diff>
--- a/Wang_CV.docx
+++ b/Wang_CV.docx
@@ -1579,7 +1579,7 @@
     <w:p>
       <w:pPr>
         <w:keepNext/>
-        <w:spacing w:after="0" w:line="240" w:lineRule="auto"/>
+        <w:spacing w:after="100" w:line="240" w:lineRule="auto"/>
         <w:jc w:val="both"/>
         <w:rPr>
           <w:rFonts w:ascii="Times New Roman" w:hAnsi="Times New Roman" w:cs="Times New Roman"/>
@@ -1657,7 +1657,12 @@
     </w:p>
     <w:p>
       <w:pPr>
-        <w:spacing w:before="100" w:after="0" w:line="240" w:lineRule="auto"/>
+        <w:spacing w:before="0" w:after="0" w:line="240" w:lineRule="auto"/>
+      </w:pPr>
+    </w:p>
+    <w:p>
+      <w:pPr>
+        <w:spacing w:before="0" w:after="0" w:line="240" w:lineRule="auto"/>
         <w:jc w:val="both"/>
         <w:rPr>
           <w:rFonts w:ascii="Times New Roman" w:hAnsi="Times New Roman" w:cs="Times New Roman"/>

</xml_diff>

<commit_message>
Update CV for JFE acceptance and 2026 events
</commit_message>
<xml_diff>
--- a/Wang_CV.docx
+++ b/Wang_CV.docx
@@ -514,7 +514,7 @@
           <w:b/>
           <w:sz w:val="24"/>
         </w:rPr>
-        <w:t>authors in alphabetical order</w:t>
+        <w:t>coauthors in alphabetical order</w:t>
       </w:r>
       <w:r>
         <w:rPr>
@@ -1602,6 +1602,9 @@
         <w:keepNext/>
         <w:spacing w:after="0" w:line="240" w:lineRule="auto"/>
         <w:jc w:val="both"/>
+        <w:tabs>
+          <w:tab w:val="left" w:pos="6480"/>
+        </w:tabs>
         <w:rPr>
           <w:rFonts w:ascii="Times New Roman" w:hAnsi="Times New Roman" w:cs="Times New Roman"/>
         </w:rPr>
@@ -1630,7 +1633,7 @@
           <w:rFonts w:ascii="Times New Roman" w:hAnsi="Times New Roman" w:cs="Times New Roman"/>
           <w:i w:val="1"/>
         </w:rPr>
-        <w:t>Journal of Financial Economics</w:t>
+        <w:t>JFE</w:t>
       </w:r>
     </w:p>
     <w:p>
@@ -2104,7 +2107,7 @@
         <w:rPr>
           <w:rFonts w:ascii="Times New Roman" w:hAnsi="Times New Roman" w:cs="Times New Roman"/>
         </w:rPr>
-        <w:t>* (scheduled)</w:t>
+        <w:t>* (scheduled), Cambridge Corporate Finance Theory Symposium 2026</w:t>
       </w:r>
     </w:p>
     <w:p>
@@ -4641,6 +4644,21 @@
         <w:rPr>
           <w:rFonts w:ascii="Times New Roman" w:hAnsi="Times New Roman" w:cs="Times New Roman"/>
         </w:rPr>
+        <w:t>CDI Conference, 2026</w:t>
+      </w:r>
+    </w:p>
+    <w:p>
+      <w:pPr>
+        <w:spacing w:after="0" w:line="240" w:lineRule="auto"/>
+        <w:jc w:val="both"/>
+        <w:rPr>
+          <w:rFonts w:ascii="Times New Roman" w:hAnsi="Times New Roman" w:cs="Times New Roman"/>
+        </w:rPr>
+      </w:pPr>
+      <w:r>
+        <w:rPr>
+          <w:rFonts w:ascii="Times New Roman" w:hAnsi="Times New Roman" w:cs="Times New Roman"/>
+        </w:rPr>
         <w:t>NBER Summer Institute, 2025</w:t>
       </w:r>
     </w:p>
@@ -5016,7 +5034,7 @@
     </w:p>
     <w:p>
       <w:pPr>
-        <w:spacing w:after="0" w:line="240" w:lineRule="auto"/>
+        <w:spacing w:after="0" w:line="100" w:lineRule="exact"/>
         <w:jc w:val="both"/>
         <w:rPr>
           <w:rFonts w:ascii="Times New Roman" w:hAnsi="Times New Roman" w:cs="Times New Roman"/>
@@ -5058,7 +5076,7 @@
     </w:p>
     <w:p>
       <w:pPr>
-        <w:spacing w:before="100" w:after="0" w:line="240" w:lineRule="auto"/>
+        <w:spacing w:before="0" w:after="0" w:line="240" w:lineRule="auto"/>
         <w:jc w:val="both"/>
         <w:rPr>
           <w:rFonts w:ascii="Times New Roman" w:hAnsi="Times New Roman" w:cs="Times New Roman"/>

</xml_diff>

<commit_message>
Update CV with 2026 presentations
</commit_message>
<xml_diff>
--- a/Wang_CV.docx
+++ b/Wang_CV.docx
@@ -1631,7 +1631,6 @@
       <w:r>
         <w:rPr>
           <w:rFonts w:ascii="Times New Roman" w:hAnsi="Times New Roman" w:cs="Times New Roman"/>
-          <w:i w:val="1"/>
         </w:rPr>
         <w:t>JFE</w:t>
       </w:r>
@@ -1987,7 +1986,7 @@
         <w:rPr>
           <w:rFonts w:ascii="Times New Roman" w:hAnsi="Times New Roman" w:cs="Times New Roman"/>
         </w:rPr>
-        <w:t xml:space="preserve"> Digital Finance Symposium 2026</w:t>
+        <w:t xml:space="preserve"> Digital Finance Symposium</w:t>
       </w:r>
       <w:r>
         <w:rPr>
@@ -2023,13 +2022,13 @@
         <w:rPr>
           <w:rFonts w:ascii="Times New Roman" w:hAnsi="Times New Roman" w:cs="Times New Roman"/>
         </w:rPr>
-        <w:t xml:space="preserve">Finance Theory Group Meeting, </w:t>
-      </w:r>
-      <w:r>
-        <w:rPr>
-          <w:rFonts w:ascii="Times New Roman" w:hAnsi="Times New Roman" w:cs="Times New Roman"/>
-        </w:rPr>
-        <w:t>SFS Cavalcade North America</w:t>
+        <w:t xml:space="preserve">FTG Meeting, </w:t>
+      </w:r>
+      <w:r>
+        <w:rPr>
+          <w:rFonts w:ascii="Times New Roman" w:hAnsi="Times New Roman" w:cs="Times New Roman"/>
+        </w:rPr>
+        <w:t>SFS Cavalcade NA</w:t>
       </w:r>
       <w:r>
         <w:rPr>
@@ -2089,7 +2088,7 @@
         <w:rPr>
           <w:rFonts w:ascii="Times New Roman" w:hAnsi="Times New Roman" w:cs="Times New Roman"/>
         </w:rPr>
-        <w:t>CICF* (scheduled)</w:t>
+        <w:t>CICF*</w:t>
       </w:r>
       <w:r>
         <w:rPr>
@@ -2107,7 +2106,7 @@
         <w:rPr>
           <w:rFonts w:ascii="Times New Roman" w:hAnsi="Times New Roman" w:cs="Times New Roman"/>
         </w:rPr>
-        <w:t>* (scheduled), Cambridge Corporate Finance Theory Symposium 2026</w:t>
+        <w:t>*, Cambridge Corporate Finance Theory Symposium, OxFIT, AsFA*, FIRN Money, Credit &amp; Financial Stability Meeting*, Climate Finance &amp; Business*</w:t>
       </w:r>
     </w:p>
     <w:p>

</xml_diff>

<commit_message>
Reorder 2026 CV presentations
</commit_message>
<xml_diff>
--- a/Wang_CV.docx
+++ b/Wang_CV.docx
@@ -1960,153 +1960,153 @@
         <w:rPr>
           <w:rFonts w:ascii="Times New Roman" w:hAnsi="Times New Roman" w:cs="Times New Roman"/>
         </w:rPr>
-        <w:t xml:space="preserve">: AEA, AFA, </w:t>
-      </w:r>
-      <w:r>
-        <w:rPr>
-          <w:rFonts w:ascii="Times New Roman" w:hAnsi="Times New Roman" w:cs="Times New Roman"/>
-        </w:rPr>
-        <w:t>FTG Junior Research Group Meeting</w:t>
-      </w:r>
-      <w:r>
-        <w:rPr>
-          <w:rFonts w:ascii="Times New Roman" w:hAnsi="Times New Roman" w:cs="Times New Roman"/>
-        </w:rPr>
-        <w:t xml:space="preserve">, </w:t>
+        <w:t xml:space="preserve">: AEA, AFA, FTG Junior Research Group Meeting, PolyU Digital Finance Symposium, Microstructure Exchange, Annual Conference on Network Science and Economics, FTG Meeting, SFS Cavalcade NA, FIRS, Cambridge Corporate Finance Theory Symposium, OxFIT, SAIF Annual Research Conference*, CICF*, Future of Financial Information Conference*, FIRN Money, Credit &amp; Financial Stability Meeting*, Climate Finance &amp; Business*</w:t>
+      </w:r>
+      <w:r>
+        <w:rPr>
+          <w:rFonts w:ascii="Times New Roman" w:hAnsi="Times New Roman" w:cs="Times New Roman"/>
+        </w:rPr>
+        <w:t/>
+      </w:r>
+      <w:r>
+        <w:rPr>
+          <w:rFonts w:ascii="Times New Roman" w:hAnsi="Times New Roman" w:cs="Times New Roman"/>
+        </w:rPr>
+        <w:t xml:space="preserve"/>
       </w:r>
       <w:proofErr w:type="spellStart"/>
       <w:r>
         <w:rPr>
           <w:rFonts w:ascii="Times New Roman" w:hAnsi="Times New Roman" w:cs="Times New Roman"/>
         </w:rPr>
-        <w:t>PolyU</w:t>
+        <w:t/>
       </w:r>
       <w:proofErr w:type="spellEnd"/>
       <w:r>
         <w:rPr>
           <w:rFonts w:ascii="Times New Roman" w:hAnsi="Times New Roman" w:cs="Times New Roman"/>
         </w:rPr>
-        <w:t xml:space="preserve"> Digital Finance Symposium</w:t>
-      </w:r>
-      <w:r>
-        <w:rPr>
-          <w:rFonts w:ascii="Times New Roman" w:hAnsi="Times New Roman" w:cs="Times New Roman"/>
-        </w:rPr>
-        <w:t xml:space="preserve">, </w:t>
-      </w:r>
-      <w:r>
-        <w:rPr>
-          <w:rFonts w:ascii="Times New Roman" w:hAnsi="Times New Roman" w:cs="Times New Roman"/>
-        </w:rPr>
-        <w:t xml:space="preserve">Microstructure Exchange, </w:t>
-      </w:r>
-      <w:r>
-        <w:rPr>
-          <w:rFonts w:ascii="Times New Roman" w:hAnsi="Times New Roman" w:cs="Times New Roman"/>
-        </w:rPr>
-        <w:t>Annual Conference on Network Science and Economics</w:t>
-      </w:r>
-      <w:r>
-        <w:rPr>
-          <w:rFonts w:ascii="Times New Roman" w:hAnsi="Times New Roman" w:cs="Times New Roman"/>
-        </w:rPr>
-        <w:t>,</w:t>
-      </w:r>
-      <w:r>
-        <w:rPr>
-          <w:rFonts w:ascii="Times New Roman" w:hAnsi="Times New Roman" w:cs="Times New Roman"/>
-        </w:rPr>
-        <w:t xml:space="preserve"> </w:t>
-      </w:r>
-      <w:r>
-        <w:rPr>
-          <w:rFonts w:ascii="Times New Roman" w:hAnsi="Times New Roman" w:cs="Times New Roman"/>
-        </w:rPr>
-        <w:t xml:space="preserve">FTG Meeting, </w:t>
-      </w:r>
-      <w:r>
-        <w:rPr>
-          <w:rFonts w:ascii="Times New Roman" w:hAnsi="Times New Roman" w:cs="Times New Roman"/>
-        </w:rPr>
-        <w:t>SFS Cavalcade NA</w:t>
-      </w:r>
-      <w:r>
-        <w:rPr>
-          <w:rFonts w:ascii="Times New Roman" w:hAnsi="Times New Roman" w:cs="Times New Roman"/>
-        </w:rPr>
-        <w:t>, FIRS</w:t>
-      </w:r>
-      <w:r>
-        <w:rPr>
-          <w:rFonts w:ascii="Times New Roman" w:hAnsi="Times New Roman" w:cs="Times New Roman"/>
-        </w:rPr>
-        <w:t>,</w:t>
-      </w:r>
-      <w:r>
-        <w:rPr>
-          <w:rFonts w:ascii="Times New Roman" w:hAnsi="Times New Roman" w:cs="Times New Roman"/>
-        </w:rPr>
-        <w:t xml:space="preserve"> </w:t>
-      </w:r>
-      <w:r>
-        <w:rPr>
-          <w:rFonts w:ascii="Times New Roman" w:hAnsi="Times New Roman" w:cs="Times New Roman"/>
-        </w:rPr>
-        <w:t>SAIF A</w:t>
-      </w:r>
-      <w:r>
-        <w:rPr>
-          <w:rFonts w:ascii="Times New Roman" w:hAnsi="Times New Roman" w:cs="Times New Roman"/>
-        </w:rPr>
-        <w:t>nnual</w:t>
-      </w:r>
-      <w:r>
-        <w:rPr>
-          <w:rFonts w:ascii="Times New Roman" w:hAnsi="Times New Roman" w:cs="Times New Roman"/>
-        </w:rPr>
-        <w:t xml:space="preserve"> R</w:t>
-      </w:r>
-      <w:r>
-        <w:rPr>
-          <w:rFonts w:ascii="Times New Roman" w:hAnsi="Times New Roman" w:cs="Times New Roman"/>
-        </w:rPr>
-        <w:t>esearch</w:t>
-      </w:r>
-      <w:r>
-        <w:rPr>
-          <w:rFonts w:ascii="Times New Roman" w:hAnsi="Times New Roman" w:cs="Times New Roman"/>
-        </w:rPr>
-        <w:t xml:space="preserve"> C</w:t>
-      </w:r>
-      <w:r>
-        <w:rPr>
-          <w:rFonts w:ascii="Times New Roman" w:hAnsi="Times New Roman" w:cs="Times New Roman"/>
-        </w:rPr>
-        <w:t xml:space="preserve">onference*, </w:t>
-      </w:r>
-      <w:r>
-        <w:rPr>
-          <w:rFonts w:ascii="Times New Roman" w:hAnsi="Times New Roman" w:cs="Times New Roman"/>
-        </w:rPr>
-        <w:t>CICF*</w:t>
-      </w:r>
-      <w:r>
-        <w:rPr>
-          <w:rFonts w:ascii="Times New Roman" w:hAnsi="Times New Roman" w:cs="Times New Roman"/>
-        </w:rPr>
-        <w:t xml:space="preserve">, </w:t>
-      </w:r>
-      <w:r>
-        <w:rPr>
-          <w:rFonts w:ascii="Times New Roman" w:hAnsi="Times New Roman" w:cs="Times New Roman"/>
-        </w:rPr>
-        <w:t>Future of Financial Information Conference</w:t>
-      </w:r>
-      <w:r>
-        <w:rPr>
-          <w:rFonts w:ascii="Times New Roman" w:hAnsi="Times New Roman" w:cs="Times New Roman"/>
-        </w:rPr>
-        <w:t>*, Cambridge Corporate Finance Theory Symposium, OxFIT, AsFA*, FIRN Money, Credit &amp; Financial Stability Meeting*, Climate Finance &amp; Business*</w:t>
+        <w:t xml:space="preserve"/>
+      </w:r>
+      <w:r>
+        <w:rPr>
+          <w:rFonts w:ascii="Times New Roman" w:hAnsi="Times New Roman" w:cs="Times New Roman"/>
+        </w:rPr>
+        <w:t xml:space="preserve"/>
+      </w:r>
+      <w:r>
+        <w:rPr>
+          <w:rFonts w:ascii="Times New Roman" w:hAnsi="Times New Roman" w:cs="Times New Roman"/>
+        </w:rPr>
+        <w:t xml:space="preserve"/>
+      </w:r>
+      <w:r>
+        <w:rPr>
+          <w:rFonts w:ascii="Times New Roman" w:hAnsi="Times New Roman" w:cs="Times New Roman"/>
+        </w:rPr>
+        <w:t/>
+      </w:r>
+      <w:r>
+        <w:rPr>
+          <w:rFonts w:ascii="Times New Roman" w:hAnsi="Times New Roman" w:cs="Times New Roman"/>
+        </w:rPr>
+        <w:t/>
+      </w:r>
+      <w:r>
+        <w:rPr>
+          <w:rFonts w:ascii="Times New Roman" w:hAnsi="Times New Roman" w:cs="Times New Roman"/>
+        </w:rPr>
+        <w:t xml:space="preserve"/>
+      </w:r>
+      <w:r>
+        <w:rPr>
+          <w:rFonts w:ascii="Times New Roman" w:hAnsi="Times New Roman" w:cs="Times New Roman"/>
+        </w:rPr>
+        <w:t xml:space="preserve"/>
+      </w:r>
+      <w:r>
+        <w:rPr>
+          <w:rFonts w:ascii="Times New Roman" w:hAnsi="Times New Roman" w:cs="Times New Roman"/>
+        </w:rPr>
+        <w:t/>
+      </w:r>
+      <w:r>
+        <w:rPr>
+          <w:rFonts w:ascii="Times New Roman" w:hAnsi="Times New Roman" w:cs="Times New Roman"/>
+        </w:rPr>
+        <w:t/>
+      </w:r>
+      <w:r>
+        <w:rPr>
+          <w:rFonts w:ascii="Times New Roman" w:hAnsi="Times New Roman" w:cs="Times New Roman"/>
+        </w:rPr>
+        <w:t/>
+      </w:r>
+      <w:r>
+        <w:rPr>
+          <w:rFonts w:ascii="Times New Roman" w:hAnsi="Times New Roman" w:cs="Times New Roman"/>
+        </w:rPr>
+        <w:t xml:space="preserve"/>
+      </w:r>
+      <w:r>
+        <w:rPr>
+          <w:rFonts w:ascii="Times New Roman" w:hAnsi="Times New Roman" w:cs="Times New Roman"/>
+        </w:rPr>
+        <w:t/>
+      </w:r>
+      <w:r>
+        <w:rPr>
+          <w:rFonts w:ascii="Times New Roman" w:hAnsi="Times New Roman" w:cs="Times New Roman"/>
+        </w:rPr>
+        <w:t/>
+      </w:r>
+      <w:r>
+        <w:rPr>
+          <w:rFonts w:ascii="Times New Roman" w:hAnsi="Times New Roman" w:cs="Times New Roman"/>
+        </w:rPr>
+        <w:t xml:space="preserve"/>
+      </w:r>
+      <w:r>
+        <w:rPr>
+          <w:rFonts w:ascii="Times New Roman" w:hAnsi="Times New Roman" w:cs="Times New Roman"/>
+        </w:rPr>
+        <w:t/>
+      </w:r>
+      <w:r>
+        <w:rPr>
+          <w:rFonts w:ascii="Times New Roman" w:hAnsi="Times New Roman" w:cs="Times New Roman"/>
+        </w:rPr>
+        <w:t xml:space="preserve"/>
+      </w:r>
+      <w:r>
+        <w:rPr>
+          <w:rFonts w:ascii="Times New Roman" w:hAnsi="Times New Roman" w:cs="Times New Roman"/>
+        </w:rPr>
+        <w:t xml:space="preserve"/>
+      </w:r>
+      <w:r>
+        <w:rPr>
+          <w:rFonts w:ascii="Times New Roman" w:hAnsi="Times New Roman" w:cs="Times New Roman"/>
+        </w:rPr>
+        <w:t/>
+      </w:r>
+      <w:r>
+        <w:rPr>
+          <w:rFonts w:ascii="Times New Roman" w:hAnsi="Times New Roman" w:cs="Times New Roman"/>
+        </w:rPr>
+        <w:t xml:space="preserve"/>
+      </w:r>
+      <w:r>
+        <w:rPr>
+          <w:rFonts w:ascii="Times New Roman" w:hAnsi="Times New Roman" w:cs="Times New Roman"/>
+        </w:rPr>
+        <w:t/>
+      </w:r>
+      <w:r>
+        <w:rPr>
+          <w:rFonts w:ascii="Times New Roman" w:hAnsi="Times New Roman" w:cs="Times New Roman"/>
+        </w:rPr>
+        <w:t/>
       </w:r>
     </w:p>
     <w:p>

</xml_diff>

<commit_message>
Mark China Walls conditionally accepted
</commit_message>
<xml_diff>
--- a/Wang_CV.docx
+++ b/Wang_CV.docx
@@ -152,7 +152,7 @@
         <w:rPr>
           <w:rFonts w:ascii="Times New Roman" w:hAnsi="Times New Roman" w:cs="Times New Roman"/>
         </w:rPr>
-        <w:t>September</w:t>
+        <w:t>October</w:t>
       </w:r>
       <w:r>
         <w:rPr>
@@ -1626,7 +1626,7 @@
           <w:rFonts w:ascii="Times New Roman" w:hAnsi="Times New Roman" w:cs="Times New Roman"/>
         </w:rPr>
         <w:tab/>
-        <w:t xml:space="preserve">Forthcoming at </w:t>
+        <w:t xml:space="preserve">Conditionally accepted at </w:t>
       </w:r>
       <w:r>
         <w:rPr>

</xml_diff>

<commit_message>
Preserve four-page CV layout
</commit_message>
<xml_diff>
--- a/Wang_CV.docx
+++ b/Wang_CV.docx
@@ -4375,15 +4375,6 @@
         <w:jc w:val="both"/>
         <w:rPr>
           <w:rFonts w:ascii="Times New Roman" w:hAnsi="Times New Roman" w:cs="Times New Roman"/>
-        </w:rPr>
-      </w:pPr>
-    </w:p>
-    <w:p>
-      <w:pPr>
-        <w:spacing w:after="0" w:line="240" w:lineRule="auto"/>
-        <w:jc w:val="both"/>
-        <w:rPr>
-          <w:rFonts w:ascii="Times New Roman" w:hAnsi="Times New Roman" w:cs="Times New Roman"/>
           <w:b/>
           <w:sz w:val="24"/>
         </w:rPr>
@@ -4569,18 +4560,6 @@
         </w:rPr>
         <w:t>Wharton Micro Finance Seminar</w:t>
       </w:r>
-    </w:p>
-    <w:p>
-      <w:pPr>
-        <w:spacing w:after="0" w:line="240" w:lineRule="auto"/>
-        <w:jc w:val="both"/>
-        <w:rPr>
-          <w:rFonts w:ascii="Times New Roman" w:hAnsi="Times New Roman" w:cs="Times New Roman"/>
-          <w:b/>
-          <w:smallCaps/>
-          <w:sz w:val="24"/>
-        </w:rPr>
-      </w:pPr>
     </w:p>
     <w:p>
       <w:pPr>

</xml_diff>

<commit_message>
Restore CV spacing and allow natural page count
</commit_message>
<xml_diff>
--- a/Wang_CV.docx
+++ b/Wang_CV.docx
@@ -4375,6 +4375,15 @@
         <w:jc w:val="both"/>
         <w:rPr>
           <w:rFonts w:ascii="Times New Roman" w:hAnsi="Times New Roman" w:cs="Times New Roman"/>
+        </w:rPr>
+      </w:pPr>
+    </w:p>
+    <w:p>
+      <w:pPr>
+        <w:spacing w:after="0" w:line="240" w:lineRule="auto"/>
+        <w:jc w:val="both"/>
+        <w:rPr>
+          <w:rFonts w:ascii="Times New Roman" w:hAnsi="Times New Roman" w:cs="Times New Roman"/>
           <w:b/>
           <w:sz w:val="24"/>
         </w:rPr>
@@ -4560,6 +4569,18 @@
         </w:rPr>
         <w:t>Wharton Micro Finance Seminar</w:t>
       </w:r>
+    </w:p>
+    <w:p>
+      <w:pPr>
+        <w:spacing w:after="0" w:line="240" w:lineRule="auto"/>
+        <w:jc w:val="both"/>
+        <w:rPr>
+          <w:rFonts w:ascii="Times New Roman" w:hAnsi="Times New Roman" w:cs="Times New Roman"/>
+          <w:b/>
+          <w:smallCaps/>
+          <w:sz w:val="24"/>
+        </w:rPr>
+      </w:pPr>
     </w:p>
     <w:p>
       <w:pPr>

</xml_diff>

<commit_message>
Restore Teaching and Advising spacing
</commit_message>
<xml_diff>
--- a/Wang_CV.docx
+++ b/Wang_CV.docx
@@ -5033,7 +5033,7 @@
     </w:p>
     <w:p>
       <w:pPr>
-        <w:spacing w:after="0" w:line="100" w:lineRule="exact"/>
+        <w:spacing w:after="0" w:line="240" w:lineRule="auto"/>
         <w:jc w:val="both"/>
         <w:rPr>
           <w:rFonts w:ascii="Times New Roman" w:hAnsi="Times New Roman" w:cs="Times New Roman"/>
@@ -5075,7 +5075,7 @@
     </w:p>
     <w:p>
       <w:pPr>
-        <w:spacing w:before="0" w:after="0" w:line="240" w:lineRule="auto"/>
+        <w:spacing w:before="100" w:after="0" w:line="240" w:lineRule="auto"/>
         <w:jc w:val="both"/>
         <w:rPr>
           <w:rFonts w:ascii="Times New Roman" w:hAnsi="Times New Roman" w:cs="Times New Roman"/>
@@ -5132,7 +5132,7 @@
     </w:p>
     <w:p>
       <w:pPr>
-        <w:spacing w:before="0" w:after="0" w:line="240" w:lineRule="auto"/>
+        <w:spacing w:before="100" w:after="0" w:line="240" w:lineRule="auto"/>
         <w:jc w:val="both"/>
         <w:rPr>
           <w:rFonts w:ascii="Times New Roman" w:hAnsi="Times New Roman" w:cs="Times New Roman"/>

</xml_diff>

<commit_message>
Restore remaining Teaching and Advising spacing
</commit_message>
<xml_diff>
--- a/Wang_CV.docx
+++ b/Wang_CV.docx
@@ -5108,6 +5108,18 @@
         </w:rPr>
         <w:t>Ruslan Svershkov, Warwick Business School, Committee member</w:t>
       </w:r>
+    </w:p>
+    <w:p>
+      <w:pPr>
+        <w:spacing w:after="0" w:line="240" w:lineRule="auto"/>
+        <w:jc w:val="both"/>
+        <w:rPr>
+          <w:rFonts w:ascii="Times New Roman" w:hAnsi="Times New Roman" w:cs="Times New Roman"/>
+          <w:b/>
+          <w:sz w:val="24"/>
+          <w:szCs w:val="24"/>
+        </w:rPr>
+      </w:pPr>
     </w:p>
     <w:p>
       <w:pPr>

</xml_diff>

<commit_message>
Mark China Walls forthcoming at JFE
</commit_message>
<xml_diff>
--- a/Wang_CV.docx
+++ b/Wang_CV.docx
@@ -1610,29 +1610,9 @@
         </w:rPr>
       </w:pPr>
       <w:r>
-        <w:rPr>
-          <w:rFonts w:ascii="Times New Roman" w:hAnsi="Times New Roman" w:cs="Times New Roman"/>
-        </w:rPr>
-        <w:t>4</w:t>
-      </w:r>
-      <w:r>
-        <w:rPr>
-          <w:rFonts w:ascii="Times New Roman" w:hAnsi="Times New Roman" w:cs="Times New Roman"/>
-        </w:rPr>
-        <w:t>. China Walls</w:t>
-      </w:r>
-      <w:r>
-        <w:rPr>
-          <w:rFonts w:ascii="Times New Roman" w:hAnsi="Times New Roman" w:cs="Times New Roman"/>
-        </w:rPr>
-        <w:tab/>
-        <w:t xml:space="preserve">Conditionally accepted at </w:t>
-      </w:r>
-      <w:r>
-        <w:rPr>
-          <w:rFonts w:ascii="Times New Roman" w:hAnsi="Times New Roman" w:cs="Times New Roman"/>
-        </w:rPr>
-        <w:t>JFE</w:t>
+        <w:t>4. China Walls</w:t>
+        <w:tab/>
+        <w:t>Forthcoming at JFE</w:t>
       </w:r>
     </w:p>
     <w:p>

</xml_diff>